<commit_message>
Update marking scheme and name list files; modify DataTable sorting and filtering behavior in index.html
</commit_message>
<xml_diff>
--- a/sample/VTC Test Marking Scheme.docx
+++ b/sample/VTC Test Marking Scheme.docx
@@ -23,18 +23,36 @@
       </w:r>
     </w:p>
     <w:p>
-      <w:pPr>
-        <w:rPr>
-          <w:b/>
-          <w:bCs/>
-        </w:rPr>
-      </w:pPr>
-      <w:r>
-        <w:rPr>
-          <w:b/>
-          <w:bCs/>
-        </w:rPr>
-        <w:t>Q1: VPET and Workforce</w:t>
+      <w:r>
+        <w:rPr>
+          <w:b/>
+          <w:bCs/>
+        </w:rPr>
+        <w:t>Q1: The Role of VTC</w:t>
+      </w:r>
+      <w:r>
+        <w:br/>
+        <w:t xml:space="preserve">The VTC is the largest provider of </w:t>
+      </w:r>
+      <w:r>
+        <w:rPr>
+          <w:b/>
+          <w:bCs/>
+        </w:rPr>
+        <w:t>VPET</w:t>
+      </w:r>
+      <w:r>
+        <w:t xml:space="preserve"> in Hong Kong. Briefly explain what </w:t>
+      </w:r>
+      <w:r>
+        <w:rPr>
+          <w:b/>
+          <w:bCs/>
+        </w:rPr>
+        <w:t>VPET</w:t>
+      </w:r>
+      <w:r>
+        <w:t xml:space="preserve"> stands for and why it is important for Hong Kong’s workforce development.</w:t>
       </w:r>
     </w:p>
     <w:p>
@@ -164,12 +182,46 @@
           <w:bCs/>
         </w:rPr>
       </w:pPr>
-      <w:r>
-        <w:rPr>
-          <w:b/>
-          <w:bCs/>
-        </w:rPr>
-        <w:t>Q2: IVE vs. THEi</w:t>
+    </w:p>
+    <w:p>
+      <w:r>
+        <w:rPr>
+          <w:b/>
+          <w:bCs/>
+        </w:rPr>
+        <w:t>Q2: Member Institutions</w:t>
+      </w:r>
+      <w:r>
+        <w:br/>
+        <w:t xml:space="preserve">Compare </w:t>
+      </w:r>
+      <w:r>
+        <w:rPr>
+          <w:b/>
+          <w:bCs/>
+        </w:rPr>
+        <w:t>IVE (Hong Kong Institute of Vocational Education)</w:t>
+      </w:r>
+      <w:r>
+        <w:t xml:space="preserve"> and </w:t>
+      </w:r>
+      <w:r>
+        <w:rPr>
+          <w:b/>
+          <w:bCs/>
+        </w:rPr>
+        <w:t>THEi (Technological and Higher Education Institute of Hong Kong)</w:t>
+      </w:r>
+      <w:r>
+        <w:t>. What is the main difference between the types of qualifications/</w:t>
+      </w:r>
+      <w:proofErr w:type="spellStart"/>
+      <w:r>
+        <w:t>programmes</w:t>
+      </w:r>
+      <w:proofErr w:type="spellEnd"/>
+      <w:r>
+        <w:t xml:space="preserve"> offered by these two institutions?</w:t>
       </w:r>
     </w:p>
     <w:p>
@@ -207,6 +259,13 @@
         <w:t>Higher Diploma</w:t>
       </w:r>
       <w:r>
+        <w:rPr>
+          <w:b/>
+          <w:bCs/>
+        </w:rPr>
+        <w:t xml:space="preserve"> (HD)</w:t>
+      </w:r>
+      <w:r>
         <w:t xml:space="preserve"> </w:t>
       </w:r>
       <w:proofErr w:type="spellStart"/>
@@ -225,17 +284,8 @@
         <w:t>THEi</w:t>
       </w:r>
       <w:r>
-        <w:t xml:space="preserve"> focuses on </w:t>
-      </w:r>
-      <w:proofErr w:type="gramStart"/>
-      <w:r>
-        <w:t>vocationally-oriented</w:t>
-      </w:r>
-      <w:proofErr w:type="gramEnd"/>
-      <w:r>
-        <w:t xml:space="preserve"> </w:t>
-      </w:r>
-      <w:proofErr w:type="gramStart"/>
+        <w:t xml:space="preserve"> focuses on vocationally-oriented </w:t>
+      </w:r>
       <w:r>
         <w:rPr>
           <w:b/>
@@ -243,7 +293,6 @@
         </w:rPr>
         <w:t>Bachelor’s Degree</w:t>
       </w:r>
-      <w:proofErr w:type="gramEnd"/>
       <w:r>
         <w:t xml:space="preserve"> </w:t>
       </w:r>
@@ -307,30 +356,38 @@
         <w:t>[5 marks]</w:t>
       </w:r>
       <w:r>
-        <w:t xml:space="preserve"> Correctly identifying that THEi offers </w:t>
-      </w:r>
-      <w:proofErr w:type="gramStart"/>
-      <w:r>
-        <w:t>Bachelor's</w:t>
-      </w:r>
-      <w:proofErr w:type="gramEnd"/>
-      <w:r>
-        <w:t xml:space="preserve"> Degrees.</w:t>
-      </w:r>
-    </w:p>
-    <w:p>
-      <w:pPr>
-        <w:rPr>
-          <w:b/>
-          <w:bCs/>
-        </w:rPr>
-      </w:pPr>
-      <w:r>
-        <w:rPr>
-          <w:b/>
-          <w:bCs/>
-        </w:rPr>
-        <w:t>Q3: "Think and Do"</w:t>
+        <w:t xml:space="preserve"> Correctly identifying that THEi offers Bachelor's Degrees.</w:t>
+      </w:r>
+    </w:p>
+    <w:p>
+      <w:pPr>
+        <w:rPr>
+          <w:b/>
+          <w:bCs/>
+        </w:rPr>
+      </w:pPr>
+    </w:p>
+    <w:p>
+      <w:r>
+        <w:rPr>
+          <w:b/>
+          <w:bCs/>
+        </w:rPr>
+        <w:t>Q3: Educational Philosophy</w:t>
+      </w:r>
+      <w:r>
+        <w:br/>
+        <w:t xml:space="preserve">VTC emphasizes the </w:t>
+      </w:r>
+      <w:r>
+        <w:rPr>
+          <w:b/>
+          <w:bCs/>
+        </w:rPr>
+        <w:t>"Think and Do"</w:t>
+      </w:r>
+      <w:r>
+        <w:t xml:space="preserve"> approach. Explain what this phrase means in the context of a student's learning experience.</w:t>
       </w:r>
     </w:p>
     <w:p>
@@ -345,6 +402,7 @@
           <w:b/>
           <w:bCs/>
         </w:rPr>
+        <w:lastRenderedPageBreak/>
         <w:t>Answer:</w:t>
       </w:r>
       <w:r>
@@ -417,7 +475,6 @@
           <w:b/>
           <w:bCs/>
         </w:rPr>
-        <w:lastRenderedPageBreak/>
         <w:t>[4 marks]</w:t>
       </w:r>
       <w:r>
@@ -431,12 +488,28 @@
           <w:bCs/>
         </w:rPr>
       </w:pPr>
-      <w:r>
-        <w:rPr>
-          <w:b/>
-          <w:bCs/>
-        </w:rPr>
-        <w:t>Q4: Study Pathways (Foundation)</w:t>
+    </w:p>
+    <w:p>
+      <w:r>
+        <w:rPr>
+          <w:b/>
+          <w:bCs/>
+        </w:rPr>
+        <w:t>Q4: Study Pathways</w:t>
+      </w:r>
+      <w:r>
+        <w:br/>
+        <w:t xml:space="preserve">If a Secondary 6 student does </w:t>
+      </w:r>
+      <w:r>
+        <w:rPr>
+          <w:b/>
+          <w:bCs/>
+        </w:rPr>
+        <w:t>not</w:t>
+      </w:r>
+      <w:r>
+        <w:t xml:space="preserve"> achieve the minimum entrance requirements for a Bachelor's Degree or a Higher Diploma, what is the VTC study pathway available to them to eventually reach a Higher Diploma level? (Name the specific foundation programme).</w:t>
       </w:r>
     </w:p>
     <w:p>
@@ -474,6 +547,17 @@
         <w:t>Higher Diploma</w:t>
       </w:r>
       <w:r>
+        <w:rPr>
+          <w:b/>
+          <w:bCs/>
+        </w:rPr>
+        <w:t xml:space="preserve"> (HD)</w:t>
+      </w:r>
+      <w:r>
+        <w:rPr>
+          <w:b/>
+          <w:bCs/>
+        </w:rPr>
         <w:t xml:space="preserve"> </w:t>
       </w:r>
       <w:proofErr w:type="spellStart"/>
@@ -546,12 +630,28 @@
           <w:bCs/>
         </w:rPr>
       </w:pPr>
+    </w:p>
+    <w:p>
       <w:r>
         <w:rPr>
           <w:b/>
           <w:bCs/>
         </w:rPr>
         <w:t>Q5: Industry Partnership</w:t>
+      </w:r>
+      <w:r>
+        <w:br/>
+        <w:t xml:space="preserve">Why does the VTC collaborate closely with industry partners (companies and trade associations)? Give </w:t>
+      </w:r>
+      <w:r>
+        <w:rPr>
+          <w:b/>
+          <w:bCs/>
+        </w:rPr>
+        <w:t>two</w:t>
+      </w:r>
+      <w:r>
+        <w:t xml:space="preserve"> examples of how this benefits students.</w:t>
       </w:r>
     </w:p>
     <w:p>
@@ -569,15 +669,7 @@
         <w:t>Answer:</w:t>
       </w:r>
       <w:r>
-        <w:t xml:space="preserve"> Collaboration ensures the curriculum is </w:t>
-      </w:r>
-      <w:proofErr w:type="gramStart"/>
-      <w:r>
-        <w:t>up-to-date</w:t>
-      </w:r>
-      <w:proofErr w:type="gramEnd"/>
-      <w:r>
-        <w:t xml:space="preserve"> with market trends. Benefits include: (1) Internship/Work-integrated learning opportunities, (2) Job placement support, (3) Access to industry-standard equipment/facilities.</w:t>
+        <w:t xml:space="preserve"> Collaboration ensures the curriculum is up-to-date with market trends. Benefits include: (1) Internship/Work-integrated learning opportunities, (2) Job placement support, (3) Access to industry-standard equipment/facilities.</w:t>
       </w:r>
     </w:p>
     <w:p>
@@ -628,6 +720,7 @@
           <w:b/>
           <w:bCs/>
         </w:rPr>
+        <w:lastRenderedPageBreak/>
         <w:t>[3 marks]</w:t>
       </w:r>
       <w:r>
@@ -655,7 +748,7 @@
     <w:p>
       <w:r>
         <w:pict w14:anchorId="723F8F83">
-          <v:rect id="_x0000_i1031" style="width:0;height:1.5pt" o:hralign="center" o:hrstd="t" o:hr="t" fillcolor="#a0a0a0" stroked="f"/>
+          <v:rect id="_x0000_i1025" style="width:0;height:1.5pt" o:hralign="center" o:hrstd="t" o:hr="t" fillcolor="#a0a0a0" stroked="f"/>
         </w:pict>
       </w:r>
     </w:p>
@@ -2277,6 +2370,7 @@
   <w:style w:type="character" w:default="1" w:styleId="DefaultParagraphFont">
     <w:name w:val="Default Paragraph Font"/>
     <w:uiPriority w:val="1"/>
+    <w:semiHidden/>
     <w:unhideWhenUsed/>
   </w:style>
   <w:style w:type="table" w:default="1" w:styleId="TableNormal">

</xml_diff>